<commit_message>
Modificaciones en etiquetas, manejo de errores, mejoras en stock
</commit_message>
<xml_diff>
--- a/docs/manual-gastronomia/Manual_Usuario_AnitaERP_Modulo_Gastronomia.docx
+++ b/docs/manual-gastronomia/Manual_Usuario_AnitaERP_Modulo_Gastronomia.docx
@@ -307,6 +307,19 @@
           <w:szCs w:val="22"/>
         </w:rPr>
         <w:t xml:space="preserve">En el despliegue AGG están activas las integraciones Waitry (kioscos/tótems, conciliación Informe Z al cierre de jornada) y Wigos (canjes de premios por cupón y canje diario de fidelidad por tarjeta). Ver capítulo dedicado.</w:t>
+      </w:r>
+    </w:p>
+    <w:p>
+      <w:pPr>
+        <w:jc w:val="both"/>
+        <w:spacing w:after="120"/>
+      </w:pPr>
+      <w:r>
+        <w:rPr>
+          <w:sz w:val="22"/>
+          <w:szCs w:val="22"/>
+        </w:rPr>
+        <w:t xml:space="preserve">Los canjes para clientes VIP (equipo Marketing) tienen manual propio: menú Canjes o enlace desde el índice de ayuda (Manual Canjes Marketing).</w:t>
       </w:r>
     </w:p>
     <w:p>

</xml_diff>